<commit_message>
Polish thesis submission layout and front matter
</commit_message>
<xml_diff>
--- a/docs/AEGIS_Thesis_Final_Md_Riaz.docx
+++ b/docs/AEGIS_Thesis_Final_Md_Riaz.docx
@@ -144,7 +144,7 @@
           <w:i w:val="0"/>
           <w:sz w:val="24"/>
         </w:rPr>
-        <w:t>Course Code: CSE 4000(A)</w:t>
+        <w:t>Course Code: CSE 4000(B)</w:t>
       </w:r>
     </w:p>
     <w:p>
@@ -250,6 +250,21 @@
           <w:sz w:val="24"/>
         </w:rPr>
         <w:t>Batch: 16th</w:t>
+      </w:r>
+    </w:p>
+    <w:p>
+      <w:pPr>
+        <w:spacing w:after="20" w:before="0" w:line="264" w:lineRule="auto"/>
+        <w:jc w:val="center"/>
+      </w:pPr>
+      <w:r>
+        <w:rPr>
+          <w:rFonts w:ascii="Times New Roman" w:hAnsi="Times New Roman"/>
+          <w:b w:val="0"/>
+          <w:i w:val="0"/>
+          <w:sz w:val="24"/>
+        </w:rPr>
+        <w:t>Semester: 8th</w:t>
       </w:r>
     </w:p>
     <w:p>
@@ -8413,7 +8428,7 @@
       <w:r>
         <w:drawing>
           <wp:inline xmlns:a="http://schemas.openxmlformats.org/drawingml/2006/main" xmlns:pic="http://schemas.openxmlformats.org/drawingml/2006/picture">
-            <wp:extent cx="5715000" cy="3039747"/>
+            <wp:extent cx="5806440" cy="3088383"/>
             <wp:docPr id="4" name="Picture 4"/>
             <wp:cNvGraphicFramePr>
               <a:graphicFrameLocks noChangeAspect="1"/>
@@ -8434,7 +8449,7 @@
                   <pic:spPr>
                     <a:xfrm>
                       <a:off x="0" y="0"/>
-                      <a:ext cx="5715000" cy="3039747"/>
+                      <a:ext cx="5806440" cy="3088383"/>
                     </a:xfrm>
                     <a:prstGeom prst="rect"/>
                   </pic:spPr>
@@ -8457,11 +8472,6 @@
           <w:sz w:val="21"/>
         </w:rPr>
         <w:t>Figure 2: AEGIS architecture pipeline (User Request to Dashboard Widget)</w:t>
-      </w:r>
-    </w:p>
-    <w:p>
-      <w:r>
-        <w:br w:type="page"/>
       </w:r>
     </w:p>
     <w:p>
@@ -9564,7 +9574,7 @@
       <w:r>
         <w:drawing>
           <wp:inline xmlns:a="http://schemas.openxmlformats.org/drawingml/2006/main" xmlns:pic="http://schemas.openxmlformats.org/drawingml/2006/picture">
-            <wp:extent cx="4937760" cy="5681523"/>
+            <wp:extent cx="4983480" cy="5734130"/>
             <wp:docPr id="6" name="Picture 6"/>
             <wp:cNvGraphicFramePr>
               <a:graphicFrameLocks noChangeAspect="1"/>
@@ -9585,7 +9595,7 @@
                   <pic:spPr>
                     <a:xfrm>
                       <a:off x="0" y="0"/>
-                      <a:ext cx="4937760" cy="5681523"/>
+                      <a:ext cx="4983480" cy="5734130"/>
                     </a:xfrm>
                     <a:prstGeom prst="rect"/>
                   </pic:spPr>
@@ -9608,11 +9618,6 @@
           <w:sz w:val="21"/>
         </w:rPr>
         <w:t>Figure 4: Vocabulary injection and original-question coverage workflow</w:t>
-      </w:r>
-    </w:p>
-    <w:p>
-      <w:r>
-        <w:br w:type="page"/>
       </w:r>
     </w:p>
     <w:p>
@@ -11126,7 +11131,7 @@
       <w:r>
         <w:drawing>
           <wp:inline xmlns:a="http://schemas.openxmlformats.org/drawingml/2006/main" xmlns:pic="http://schemas.openxmlformats.org/drawingml/2006/picture">
-            <wp:extent cx="4846320" cy="6699749"/>
+            <wp:extent cx="4892040" cy="6762954"/>
             <wp:docPr id="7" name="Picture 7"/>
             <wp:cNvGraphicFramePr>
               <a:graphicFrameLocks noChangeAspect="1"/>
@@ -11147,7 +11152,7 @@
                   <pic:spPr>
                     <a:xfrm>
                       <a:off x="0" y="0"/>
-                      <a:ext cx="4846320" cy="6699749"/>
+                      <a:ext cx="4892040" cy="6762954"/>
                     </a:xfrm>
                     <a:prstGeom prst="rect"/>
                   </pic:spPr>
@@ -14305,6 +14310,11 @@
       </w:r>
     </w:p>
     <w:p>
+      <w:r>
+        <w:br w:type="page"/>
+      </w:r>
+    </w:p>
+    <w:p>
       <w:pPr>
         <w:spacing w:before="320" w:after="160"/>
         <w:jc w:val="left"/>
@@ -17965,6 +17975,11 @@
           <w:sz w:val="24"/>
         </w:rPr>
         <w:t>Compare parser accuracy, refusal behavior, and execution validity across several OpenAI-compatible LLM APIs while keeping the compiler and semantic layer fixed.</w:t>
+      </w:r>
+    </w:p>
+    <w:p>
+      <w:r>
+        <w:br w:type="page"/>
       </w:r>
     </w:p>
     <w:p>

</xml_diff>

<commit_message>
Synchronize thesis front matter page lists
</commit_message>
<xml_diff>
--- a/docs/AEGIS_Thesis_Final_Md_Riaz.docx
+++ b/docs/AEGIS_Thesis_Final_Md_Riaz.docx
@@ -1303,7 +1303,7 @@
         </w:rPr>
         <w:t>3.2 Formative Study of Reporting Patterns</w:t>
         <w:tab/>
-        <w:t>9</w:t>
+        <w:t>8</w:t>
       </w:r>
     </w:p>
     <w:p>
@@ -1323,7 +1323,7 @@
         </w:rPr>
         <w:t>3.3 Design Principles</w:t>
         <w:tab/>
-        <w:t>10</w:t>
+        <w:t>9</w:t>
       </w:r>
     </w:p>
     <w:p>
@@ -1343,7 +1343,7 @@
         </w:rPr>
         <w:t>3.4 Formal Model</w:t>
         <w:tab/>
-        <w:t>11</w:t>
+        <w:t>10</w:t>
       </w:r>
     </w:p>
     <w:p>
@@ -1363,7 +1363,7 @@
         </w:rPr>
         <w:t>3.5 Threat Model</w:t>
         <w:tab/>
-        <w:t>11</w:t>
+        <w:t>10</w:t>
       </w:r>
     </w:p>
     <w:p>
@@ -1403,7 +1403,7 @@
         </w:rPr>
         <w:t>3.7 Semantic Layer Design</w:t>
         <w:tab/>
-        <w:t>14</w:t>
+        <w:t>13</w:t>
       </w:r>
     </w:p>
     <w:p>
@@ -1443,7 +1443,7 @@
         </w:rPr>
         <w:t>3.9 Safe Query Compiler</w:t>
         <w:tab/>
-        <w:t>18</w:t>
+        <w:t>16</w:t>
       </w:r>
     </w:p>
     <w:p>
@@ -1463,7 +1463,7 @@
         </w:rPr>
         <w:t>3.10 Visualization Selector</w:t>
         <w:tab/>
-        <w:t>19</w:t>
+        <w:t>18</w:t>
       </w:r>
     </w:p>
     <w:p>
@@ -1483,7 +1483,7 @@
         </w:rPr>
         <w:t>3.11 Widget Persistence and Reuse</w:t>
         <w:tab/>
-        <w:t>20</w:t>
+        <w:t>19</w:t>
       </w:r>
     </w:p>
     <w:p>
@@ -1503,7 +1503,7 @@
         </w:rPr>
         <w:t>Chapter 4: Experimental Work</w:t>
         <w:tab/>
-        <w:t>21</w:t>
+        <w:t>20</w:t>
       </w:r>
     </w:p>
     <w:p>
@@ -1523,7 +1523,7 @@
         </w:rPr>
         <w:t>4.1 Implementation</w:t>
         <w:tab/>
-        <w:t>21</w:t>
+        <w:t>20</w:t>
       </w:r>
     </w:p>
     <w:p>
@@ -1543,7 +1543,7 @@
         </w:rPr>
         <w:t>4.2 Experimental Environment</w:t>
         <w:tab/>
-        <w:t>22</w:t>
+        <w:t>21</w:t>
       </w:r>
     </w:p>
     <w:p>
@@ -1563,7 +1563,7 @@
         </w:rPr>
         <w:t>4.3 Benchmark Dataset Construction</w:t>
         <w:tab/>
-        <w:t>22</w:t>
+        <w:t>21</w:t>
       </w:r>
     </w:p>
     <w:p>
@@ -1583,7 +1583,7 @@
         </w:rPr>
         <w:t>4.4 Baseline and Oracle Comparisons</w:t>
         <w:tab/>
-        <w:t>23</w:t>
+        <w:t>22</w:t>
       </w:r>
     </w:p>
     <w:p>
@@ -1623,7 +1623,7 @@
         </w:rPr>
         <w:t>Chapter 5: Results and Discussion</w:t>
         <w:tab/>
-        <w:t>25</w:t>
+        <w:t>24</w:t>
       </w:r>
     </w:p>
     <w:p>
@@ -1643,7 +1643,7 @@
         </w:rPr>
         <w:t>5.1 Evaluation Overview</w:t>
         <w:tab/>
-        <w:t>25</w:t>
+        <w:t>24</w:t>
       </w:r>
     </w:p>
     <w:p>
@@ -1663,7 +1663,7 @@
         </w:rPr>
         <w:t>5.2 500-Question Natural-Language Benchmark</w:t>
         <w:tab/>
-        <w:t>25</w:t>
+        <w:t>24</w:t>
       </w:r>
     </w:p>
     <w:p>
@@ -1683,7 +1683,7 @@
         </w:rPr>
         <w:t>5.3 Admin Fidelity Benchmark</w:t>
         <w:tab/>
-        <w:t>26</w:t>
+        <w:t>25</w:t>
       </w:r>
     </w:p>
     <w:p>
@@ -1703,7 +1703,7 @@
         </w:rPr>
         <w:t>5.4 Focused Semantic Coverage</w:t>
         <w:tab/>
-        <w:t>26</w:t>
+        <w:t>25</w:t>
       </w:r>
     </w:p>
     <w:p>
@@ -1723,7 +1723,7 @@
         </w:rPr>
         <w:t>5.5 Safety Evaluation</w:t>
         <w:tab/>
-        <w:t>27</w:t>
+        <w:t>26</w:t>
       </w:r>
     </w:p>
     <w:p>
@@ -1743,7 +1743,7 @@
         </w:rPr>
         <w:t>5.6 Comparison With Direct LLM-to-SQL</w:t>
         <w:tab/>
-        <w:t>27</w:t>
+        <w:t>26</w:t>
       </w:r>
     </w:p>
     <w:p>
@@ -1763,7 +1763,7 @@
         </w:rPr>
         <w:t>5.7 Interpretation</w:t>
         <w:tab/>
-        <w:t>28</w:t>
+        <w:t>27</w:t>
       </w:r>
     </w:p>
     <w:p>
@@ -1783,7 +1783,7 @@
         </w:rPr>
         <w:t>Chapter 6: Limitations and Future Work</w:t>
         <w:tab/>
-        <w:t>29</w:t>
+        <w:t>28</w:t>
       </w:r>
     </w:p>
     <w:p>
@@ -1803,7 +1803,7 @@
         </w:rPr>
         <w:t>6.1 Limitations</w:t>
         <w:tab/>
-        <w:t>29</w:t>
+        <w:t>28</w:t>
       </w:r>
     </w:p>
     <w:p>
@@ -1823,7 +1823,7 @@
         </w:rPr>
         <w:t>6.2 Future Work</w:t>
         <w:tab/>
-        <w:t>30</w:t>
+        <w:t>29</w:t>
       </w:r>
     </w:p>
     <w:p>
@@ -1863,7 +1863,7 @@
         </w:rPr>
         <w:t>References</w:t>
         <w:tab/>
-        <w:t>32</w:t>
+        <w:t>31</w:t>
       </w:r>
     </w:p>
     <w:p>
@@ -1955,7 +1955,7 @@
         </w:rPr>
         <w:t>Figure 4: Vocabulary injection and coverage workflow</w:t>
         <w:tab/>
-        <w:t>17</w:t>
+        <w:t>16</w:t>
       </w:r>
     </w:p>
     <w:p>
@@ -1973,7 +1973,7 @@
         </w:rPr>
         <w:t>Figure 5: Two-layer SQL safety defence</w:t>
         <w:tab/>
-        <w:t>19</w:t>
+        <w:t>18</w:t>
       </w:r>
     </w:p>
     <w:p>
@@ -1991,7 +1991,7 @@
         </w:rPr>
         <w:t>Figure 6: Widget lifecycle and refresh model</w:t>
         <w:tab/>
-        <w:t>20</w:t>
+        <w:t>19</w:t>
       </w:r>
     </w:p>
     <w:p>
@@ -2065,7 +2065,7 @@
         </w:rPr>
         <w:t>Table 3.2: Semantic layer implementation contract</w:t>
         <w:tab/>
-        <w:t>15</w:t>
+        <w:t>14</w:t>
       </w:r>
     </w:p>
     <w:p>
@@ -2083,7 +2083,7 @@
         </w:rPr>
         <w:t>Table 3.3: AEGIS analytical patterns</w:t>
         <w:tab/>
-        <w:t>18</w:t>
+        <w:t>17</w:t>
       </w:r>
     </w:p>
     <w:p>
@@ -2101,7 +2101,7 @@
         </w:rPr>
         <w:t>Table 3.4: Visualization selector mapping</w:t>
         <w:tab/>
-        <w:t>20</w:t>
+        <w:t>19</w:t>
       </w:r>
     </w:p>
     <w:p>
@@ -2119,7 +2119,7 @@
         </w:rPr>
         <w:t>Table 4.1: Prototype module-to-architecture mapping</w:t>
         <w:tab/>
-        <w:t>22</w:t>
+        <w:t>21</w:t>
       </w:r>
     </w:p>
     <w:p>
@@ -2137,7 +2137,7 @@
         </w:rPr>
         <w:t>Table 4.2: Experimental setup</w:t>
         <w:tab/>
-        <w:t>22</w:t>
+        <w:t>21</w:t>
       </w:r>
     </w:p>
     <w:p>
@@ -2155,7 +2155,7 @@
         </w:rPr>
         <w:t>Table 4.3: Static evaluation datasets</w:t>
         <w:tab/>
-        <w:t>23</w:t>
+        <w:t>22</w:t>
       </w:r>
     </w:p>
     <w:p>
@@ -2173,7 +2173,7 @@
         </w:rPr>
         <w:t>Table 5.1: Current evaluation artifacts</w:t>
         <w:tab/>
-        <w:t>25</w:t>
+        <w:t>24</w:t>
       </w:r>
     </w:p>
     <w:p>
@@ -2191,7 +2191,7 @@
         </w:rPr>
         <w:t>Table 5.2: 500-question live benchmark results</w:t>
         <w:tab/>
-        <w:t>26</w:t>
+        <w:t>25</w:t>
       </w:r>
     </w:p>
     <w:p>
@@ -2209,7 +2209,7 @@
         </w:rPr>
         <w:t>Table 5.3: Admin analytics oracle benchmark</w:t>
         <w:tab/>
-        <w:t>26</w:t>
+        <w:t>25</w:t>
       </w:r>
     </w:p>
     <w:p>
@@ -2227,7 +2227,7 @@
         </w:rPr>
         <w:t>Table 5.4: Focused semantic coverage results</w:t>
         <w:tab/>
-        <w:t>27</w:t>
+        <w:t>26</w:t>
       </w:r>
     </w:p>
     <w:p>
@@ -2245,7 +2245,7 @@
         </w:rPr>
         <w:t>Table 5.5: Safety interpretation</w:t>
         <w:tab/>
-        <w:t>27</w:t>
+        <w:t>26</w:t>
       </w:r>
     </w:p>
     <w:p>
@@ -2263,7 +2263,7 @@
         </w:rPr>
         <w:t>Table 5.6: Structural comparison</w:t>
         <w:tab/>
-        <w:t>28</w:t>
+        <w:t>27</w:t>
       </w:r>
     </w:p>
     <w:p>

</xml_diff>

<commit_message>
Polish thesis and defense writing
</commit_message>
<xml_diff>
--- a/docs/AEGIS_Thesis_Final_Md_Riaz.docx
+++ b/docs/AEGIS_Thesis_Final_Md_Riaz.docx
@@ -69,7 +69,7 @@
           <w:i w:val="0"/>
           <w:sz w:val="32"/>
         </w:rPr>
-        <w:t>“AEGIS: A Constraint-Based Architecture for Safe LLM-Assisted Natural Language Analytics”</w:t>
+        <w:t>"AEGIS: A Constraint-Based Architecture for Safe LLM-Assisted Natural Language Analytics"</w:t>
       </w:r>
     </w:p>
     <w:p>
@@ -399,7 +399,7 @@
           <w:i w:val="0"/>
           <w:sz w:val="32"/>
         </w:rPr>
-        <w:t>“AEGIS: A Constraint-Based Architecture for Safe LLM-Assisted Natural Language Analytics”</w:t>
+        <w:t>"AEGIS: A Constraint-Based Architecture for Safe LLM-Assisted Natural Language Analytics"</w:t>
       </w:r>
     </w:p>
     <w:p>
@@ -903,7 +903,7 @@
           <w:i w:val="0"/>
           <w:sz w:val="24"/>
         </w:rPr>
-        <w:t>Relational databases hold data organizations need for decisions, but non-technical users often depend on developers to translate business questions into SQL. Natural-language interfaces try to close this gap, but many current systems still allow a language model to author executable SQL directly, making safety dependent on model behavior rather than system structure. This thesis presents AEGIS (Analytics Engine with Guaranteed Injection Safety), an architecture that restricts the model to intent extraction while deterministic software handles semantic mapping, permission enforcement, SQL compilation, validation, visualization selection, and widget persistence. AEGIS uses a closed semantic layer of approved metrics, dimensions, analytical patterns, and join paths, so the model never outputs SQL text. Instead, it produces a typed intent object that can be checked before any query is compiled. The final evaluation uses static nopCommerce datasets: a 500-question natural-language benchmark, 16 source-derived Admin analytics oracles, 80 Admin-fidelity phrasings, and focused semantic-coverage checks. On the 500-question live benchmark, AEGIS parsed 498 of 500 prompts, answered and executed 422 of 425 supported requests, and rejected or clarified 74 of 75 realistic boundary requests. Against the Admin analytics oracles, it achieved 16 of 16 execution validity, 16 of 16 shape accuracy, and 15 of 16 result accuracy. These results support the thesis's central claim that AEGIS is a bounded architecture for safe natural-language analytics over a governed semantic layer, not an unlimited text-to-SQL engine.</w:t>
+        <w:t>Relational databases hold data organizations need for decisions, but non-technical users often depend on developers to translate business questions into SQL. Natural-language interfaces try to close this gap, but many current systems still allow a language model to author executable SQL directly, making safety dependent on model behavior rather than system structure. This thesis presents AEGIS (Analytics Engine with Guaranteed Injection Safety), an architecture that restricts the model to intent extraction while deterministic software handles semantic mapping, permission enforcement, SQL compilation, validation, visualization selection, and widget persistence. AEGIS uses a closed semantic layer of approved metrics, dimensions, analytical patterns, and join paths, so the model never outputs SQL text. Instead, it produces a typed intent object that can be checked before any query is compiled. The final evaluation uses static nopCommerce datasets: a 500-question natural-language benchmark, 16 source-derived Admin analytics oracles, 80 Admin-fidelity phrasings, and focused semantic-coverage checks. On the 500-question live benchmark, AEGIS parsed 498 of 500 prompts, answered and executed 422 of 425 supported requests, and rejected or clarified 74 of 75 realistic boundary requests. Against the Admin analytics oracles, it achieved 16 of 16 execution validity, 16 of 16 shape accuracy, and 15 of 16 result accuracy. These results support the thesis's central claim that AEGIS is a bounded architecture for safe natural-language analytics over an approved semantic layer, not an unlimited text-to-SQL engine.</w:t>
       </w:r>
     </w:p>
     <w:p>
@@ -1953,7 +1953,7 @@
           <w:rFonts w:ascii="Times New Roman" w:hAnsi="Times New Roman"/>
           <w:sz w:val="24"/>
         </w:rPr>
-        <w:t>Figure 4: Vocabulary injection and coverage workflow</w:t>
+        <w:t>Figure 4: Vocabulary injection and structured intent validation workflow</w:t>
         <w:tab/>
         <w:t>16</w:t>
       </w:r>
@@ -2352,7 +2352,7 @@
           <w:i w:val="0"/>
           <w:sz w:val="24"/>
         </w:rPr>
-        <w:t>This thesis presents AEGIS (Analytics Engine with Guaranteed Injection Safety), a system that lets users describe their reporting needs in plain English and produces dynamic dashboard widgets that can be saved, refreshed, and reused as part of their daily workflow, without anyone writing SQL.</w:t>
+        <w:t>This thesis presents AEGIS (Analytics Engine with Guaranteed Injection Safety). The system lets users describe reporting needs in plain English and produces dashboard widgets that can be saved, refreshed, and reused in daily work, without anyone writing SQL.</w:t>
       </w:r>
     </w:p>
     <w:p>
@@ -2367,7 +2367,7 @@
           <w:i w:val="0"/>
           <w:sz w:val="24"/>
         </w:rPr>
-        <w:t>Natural language interfaces to databases (NLIDBs) try to solve this problem. The idea is simple: a user should be able to ask "which categories have the highest refund rates this month?" and get a correct, visual answer without writing SQL. Researchers have made good progress here through benchmarks such as Spider [1] and BIRD [2]. But there is still a gap between benchmark SQL generation and production-ready reporting, where answers must respect business definitions, permissions, safety rules, and reusable dashboard presentation.</w:t>
+        <w:t>Natural language interfaces to databases (NLIDBs) try to solve this problem. A user should be able to ask "which categories have the highest refund rates this month?" and get a correct, visual answer without writing SQL. Benchmarks such as Spider [1] and BIRD [2] show clear progress. But there is still a gap between benchmark SQL generation and production-ready reporting, where answers must respect business definitions, permissions, safety rules, and reusable dashboard presentation.</w:t>
       </w:r>
     </w:p>
     <w:p>
@@ -2498,7 +2498,7 @@
           <w:i w:val="0"/>
           <w:sz w:val="24"/>
         </w:rPr>
-        <w:t>These problems are not primarily about building a smarter model; they are about designing the system properly around the model. AEGIS addresses this by splitting the work into stages. The LLM's only job is to understand what the user is asking and output a structured description of the request. Everything after that, matching to the right business terms, building the SQL, selecting the chart, and saving the widget, is done by fixed rules and pre-approved templates.</w:t>
+        <w:t>These problems are not mainly about building a smarter model. They are about designing the system around the model. AEGIS splits the work into stages. The LLM understands the request and returns a structured description. Fixed rules and pre-approved templates then match business terms, build SQL, select the chart, and save the widget.</w:t>
       </w:r>
     </w:p>
     <w:p>
@@ -2527,7 +2527,7 @@
           <w:i w:val="0"/>
           <w:sz w:val="24"/>
         </w:rPr>
-        <w:t>Existing text-to-SQL research asks: how accurately can a model generate SQL from natural language? This thesis asks a different question: how can large language models be used for language understanding while being structurally prevented from generating executable SQL at all? The two pipelines differ structurally.</w:t>
+        <w:t>Existing text-to-SQL research asks how accurately a model can generate SQL from natural language. This thesis asks how a large language model can understand language while the system prevents it from generating executable SQL. The two pipelines differ structurally.</w:t>
       </w:r>
     </w:p>
     <w:p>
@@ -2572,7 +2572,7 @@
           <w:i w:val="0"/>
           <w:sz w:val="24"/>
         </w:rPr>
-        <w:t>The contribution of this thesis is therefore not improved SQL generation accuracy; it is constrained analytical artifact generation, a design approach that removes SQL generation from the LLM's role entirely and provides safety and semantic fidelity guarantees that no generative model can match unconditionally.</w:t>
+        <w:t>The contribution of this thesis is not better SQL generation. It is constrained analytical artifact generation. The design removes SQL generation from the LLM's role and gives the system safety and semantic-fidelity properties that prompt-only systems cannot guarantee.</w:t>
       </w:r>
     </w:p>
     <w:p>
@@ -2587,7 +2587,7 @@
           <w:i w:val="0"/>
           <w:sz w:val="24"/>
         </w:rPr>
-        <w:t>AEGIS does not propose a new LLM. The model is interchangeable across APIs that expose an OpenAI-compatible /v1/chat/completions interface. Because the LLM's only contract with the rest of the system is to produce a typed JSON intent object, model upgrades can improve language understanding without changing the compiler or safety infrastructure. This is model independence by design, not an implementation accident. The evaluation in Chapter 5 used an LLM API exposed through an OpenAI-compatible interface; the SQL compiler and safety layer did not depend on that provider.</w:t>
+        <w:t>AEGIS does not propose a new LLM. The model is interchangeable across APIs that expose an OpenAI-compatible /v1/chat/completions interface. Because the LLM's only contract with the rest of the system is to produce a typed JSON intent object, model upgrades can improve language understanding without changing the compiler or safety infrastructure. This model independence is part of the architecture. The evaluation in Chapter 5 used an LLM API exposed through an OpenAI-compatible interface; the SQL compiler and safety layer did not depend on that provider.</w:t>
       </w:r>
     </w:p>
     <w:p>
@@ -6348,7 +6348,7 @@
           <w:i w:val="0"/>
           <w:sz w:val="24"/>
         </w:rPr>
-        <w:t>This thesis follows a Design Science Research paradigm because the main contribution is a built and evaluated artifact: the AEGIS system. The paradigm is summarized through three requirements:</w:t>
+        <w:t>This thesis follows Design Science Research because the main contribution is a built and evaluated artifact, the AEGIS system. The method is summarized through three requirements:</w:t>
       </w:r>
     </w:p>
     <w:p>
@@ -8179,7 +8179,7 @@
           <w:i w:val="0"/>
           <w:sz w:val="24"/>
         </w:rPr>
-        <w:t>Explicitly documenting out-of-scope threats is itself a contribution: prior NL-to-SQL work rarely specifies the boundary of its safety claims, which makes meaningful security comparison difficult.</w:t>
+        <w:t>Documenting out-of-scope threats is part of the contribution. Prior NL-to-SQL work rarely specifies the boundary of its safety claims, which makes security comparison difficult.</w:t>
       </w:r>
     </w:p>
     <w:p>
@@ -8264,14 +8264,14 @@
           <w:b/>
           <w:sz w:val="24"/>
         </w:rPr>
-        <w:t xml:space="preserve">Stage 2 - Coverage Validation: </w:t>
+        <w:t xml:space="preserve">Stage 2 - Structured Intent Validation: </w:t>
       </w:r>
       <w:r>
         <w:rPr>
           <w:rFonts w:ascii="Times New Roman" w:hAnsi="Times New Roman"/>
           <w:sz w:val="24"/>
         </w:rPr>
-        <w:t>The server checks that both the metric term and the dimension term exist in the semantic layer vocabulary before anything else runs. Unknown identifiers are rejected here, with a structured message listing the available identifiers, rather than being passed to the compiler.</w:t>
+        <w:t>The server validates the LLM's structured intent against the semantic layer: metrics, dimensions, filters, patterns, and join rules must bind to approved objects. The original question is retained only for narrow non-executable cues such as write operations, direct credential or secret requests, and explicit prediction or causal-analysis requests outside the SQL-only prototype scope.</w:t>
       </w:r>
     </w:p>
     <w:p>
@@ -8428,7 +8428,7 @@
       <w:r>
         <w:drawing>
           <wp:inline xmlns:a="http://schemas.openxmlformats.org/drawingml/2006/main" xmlns:pic="http://schemas.openxmlformats.org/drawingml/2006/picture">
-            <wp:extent cx="5806440" cy="3088383"/>
+            <wp:extent cx="5806440" cy="3073589"/>
             <wp:docPr id="4" name="Picture 4"/>
             <wp:cNvGraphicFramePr>
               <a:graphicFrameLocks noChangeAspect="1"/>
@@ -8449,7 +8449,7 @@
                   <pic:spPr>
                     <a:xfrm>
                       <a:off x="0" y="0"/>
-                      <a:ext cx="5806440" cy="3088383"/>
+                      <a:ext cx="5806440" cy="3073589"/>
                     </a:xfrm>
                     <a:prstGeom prst="rect"/>
                   </pic:spPr>
@@ -8500,7 +8500,7 @@
           <w:i w:val="0"/>
           <w:sz w:val="24"/>
         </w:rPr>
-        <w:t>The semantic layer is the most important non-AI component of AEGIS. It separates business language from the underlying database structure and defines exactly which metrics, dimensions, joins, predicates, and permissions are allowed to exist. The semantic layer is also the main per-deployment implementation surface: to support another system, the developer defines that system's governed business vocabulary and join paths while preserving the same AEGIS architecture.</w:t>
+        <w:t>The semantic layer is the most important non-AI component of AEGIS. It separates business language from the underlying database structure and defines exactly which metrics, dimensions, joins, predicates, and permissions are allowed to exist. The semantic layer is also the main per-deployment implementation surface: to support another system, the developer defines that system's approved business vocabulary and join paths while preserving the same AEGIS architecture.</w:t>
       </w:r>
     </w:p>
     <w:p>
@@ -8515,7 +8515,7 @@
           <w:i w:val="0"/>
           <w:sz w:val="24"/>
         </w:rPr>
-        <w:t>This presentation follows the style used by related systems: Veezoo describes a Knowledge Graph, parser, query processor, and visualization engine [6]; G-SQL describes JSON schema serialization and rule-guided clause construction [9]; and NL4DV exposes a JSON analytic specification for attributes, tasks, and visualization choices [11]. AEGIS therefore defines the semantic layer as an explicit implementation contract rather than as a general idea.</w:t>
+        <w:t>Related systems describe their internal contract explicitly. Veezoo describes a Knowledge Graph, parser, query processor, and visualization engine [6]. G-SQL describes JSON schema serialization and rule-guided clause construction [9]. NL4DV exposes a JSON analytic specification for attributes, tasks, and visualization choices [11]. AEGIS follows that style by defining the semantic layer as an implementation contract, not as a vague concept.</w:t>
       </w:r>
     </w:p>
     <w:p>
@@ -9402,7 +9402,7 @@
           <w:i w:val="0"/>
           <w:sz w:val="24"/>
         </w:rPr>
-        <w:t>In the nopCommerce prototype, the semantic layer defines the governed metrics, dimensions, predicates, and join paths needed for the evaluated e-commerce analytics scope. The full nopCommerce schema is larger than this exposed vocabulary. Tables and fields that are not represented in the semantic layer cannot be requested through AEGIS, which is how the architecture keeps the answerable space useful but finite.</w:t>
+        <w:t>In the nopCommerce prototype, the semantic layer defines the Approved metrics, dimensions, predicates, and join paths needed for the evaluated e-commerce analytics scope. The full nopCommerce schema is larger than this exposed vocabulary. Tables and fields that are not represented in the semantic layer cannot be requested through AEGIS, which is how the architecture keeps the answerable space useful but finite.</w:t>
       </w:r>
     </w:p>
     <w:p>
@@ -9431,7 +9431,7 @@
           <w:i w:val="0"/>
           <w:sz w:val="24"/>
         </w:rPr>
-        <w:t>The central technique that makes Stage 1 reliable is vocabulary injection. At startup, AEGIS builds the system prompt by listing every approved metric and dimension name, with a plain-English description, directly from the semantic layer (approximately 1,100 tokens for 15 metrics and 34 dimensions). The LLM sees exactly which identifiers are valid and maps any user phrasing to the correct identifier without a manually maintained synonym list. This has three advantages over a synonym dictionary: zero maintenance, since adding a metric automatically updates the vocabulary the model sees; broad coverage of arbitrary user phrasing, since the model performs the mapping rather than a fixed lookup table; and token efficiency, since the full vocabulary for 15 metrics and 34 dimensions fits in roughly 1,100 tokens.</w:t>
+        <w:t>Vocabulary injection makes Stage 1 practical. At startup, AEGIS builds the system prompt from the semantic layer. The prompt lists every approved metric and dimension identifier with a plain-English description. In the current prototype, 15 metrics and 34 dimensions take about 1,100 tokens. The LLM maps user phrasing to these identifiers without a hand-written synonym list. When the system owner adds a metric, the prompt vocabulary changes with the semantic layer.</w:t>
       </w:r>
     </w:p>
     <w:p>
@@ -9446,7 +9446,7 @@
           <w:i w:val="0"/>
           <w:sz w:val="24"/>
         </w:rPr>
-        <w:t>Structured output enforcement for LLMs [16] constrains the model's response to a fixed JSON schema before any downstream validation occurs, which is why Stage 1 can rely on a typed IntentObject rather than free-form text: malformed or off-schema output is rejected at the API boundary, before Stage 2 coverage validation ever runs.</w:t>
+        <w:t>Structured output enforcement for LLMs [16] constrains the model's response to a fixed JSON schema before downstream validation runs. Stage 1 therefore relies on a typed IntentObject rather than free-form text. Malformed or off-schema output is rejected at the API boundary before structured intent validation runs.</w:t>
       </w:r>
     </w:p>
     <w:p>
@@ -9574,7 +9574,7 @@
       <w:r>
         <w:drawing>
           <wp:inline xmlns:a="http://schemas.openxmlformats.org/drawingml/2006/main" xmlns:pic="http://schemas.openxmlformats.org/drawingml/2006/picture">
-            <wp:extent cx="4983480" cy="5734130"/>
+            <wp:extent cx="4983480" cy="6251655"/>
             <wp:docPr id="6" name="Picture 6"/>
             <wp:cNvGraphicFramePr>
               <a:graphicFrameLocks noChangeAspect="1"/>
@@ -9595,7 +9595,7 @@
                   <pic:spPr>
                     <a:xfrm>
                       <a:off x="0" y="0"/>
-                      <a:ext cx="4983480" cy="5734130"/>
+                      <a:ext cx="4983480" cy="6251655"/>
                     </a:xfrm>
                     <a:prstGeom prst="rect"/>
                   </pic:spPr>
@@ -9617,7 +9617,7 @@
           <w:b/>
           <w:sz w:val="21"/>
         </w:rPr>
-        <w:t>Figure 4: Vocabulary injection and original-question coverage workflow</w:t>
+        <w:t>Figure 4: Vocabulary injection and structured intent validation workflow</w:t>
       </w:r>
     </w:p>
     <w:p>
@@ -9646,7 +9646,7 @@
           <w:i w:val="0"/>
           <w:sz w:val="24"/>
         </w:rPr>
-        <w:t>The compiler instantiates SQL from a library of parameterized templates, one per analytics pattern. Its role is not to be creative; its role is to prove that a grounded plan can be rendered using only semantic-layer objects.</w:t>
+        <w:t>The compiler builds SQL from parameterized templates, one for each analytics pattern. It does not invent joins or expressions. It proves that a grounded plan can be rendered using only semantic-layer objects.</w:t>
       </w:r>
     </w:p>
     <w:p>
@@ -9714,7 +9714,7 @@
           <w:sz w:val="19"/>
         </w:rPr>
         <w:br/>
-        <w:t>5. assemble WHERE from normalized time_range and governed predicates</w:t>
+        <w:t>5. assemble WHERE from normalized time_range and approved predicates</w:t>
       </w:r>
       <w:r>
         <w:rPr>
@@ -9761,7 +9761,7 @@
           <w:i w:val="0"/>
           <w:sz w:val="24"/>
         </w:rPr>
-        <w:t>The important implementation detail is that user text never enters a SQL identifier position. Identifiers come from Metric and Dimension objects; literal values are carried as parameters; and join clauses come from the join graph. If any slot cannot be grounded, the resolver returns reject or clarify rather than allowing the compiler to guess.</w:t>
+        <w:t>The important implementation detail is that user text never enters a SQL identifier position. Identifiers come from Metric and Dimension objects. Literal values are carried as parameters. Join clauses come from the join graph. If any slot cannot be grounded, the resolver returns reject or clarify rather than allowing the compiler to guess.</w:t>
       </w:r>
     </w:p>
     <w:p>
@@ -11119,7 +11119,7 @@
           <w:i w:val="0"/>
           <w:sz w:val="24"/>
         </w:rPr>
-        <w:t>Two safety layers apply in sequence. Layer 1 is a parameterized query engine that separates SQL structure from user-supplied inputs, so no user text is ever concatenated into the SQL string. Layer 2 is a post-compilation safety scanner that rejects any assembled query containing a forbidden construct: non-SELECT statements, UNION, EXCEPT or INTERSECT, EXEC, or references to system tables. If any forbidden pattern is detected, the compiler raises a SecurityError rather than returning a partially safe query.</w:t>
+        <w:t>Two safety layers apply in sequence. Layer 1 is a parameterized query engine that separates SQL structure from user inputs. No user text is concatenated into the SQL string. Layer 2 is a post-compilation safety scanner that rejects any assembled query containing a forbidden construct, including non-SELECT statements, UNION, EXCEPT or INTERSECT, EXEC, or references to system tables. If any forbidden pattern is detected, the compiler raises a SecurityError rather than returning a partially safe query.</w:t>
       </w:r>
     </w:p>
     <w:p>
@@ -12378,7 +12378,7 @@
           <w:i w:val="0"/>
           <w:sz w:val="24"/>
         </w:rPr>
-        <w:t>AEGIS is implemented as a web application with a vanilla HTML and JavaScript frontend and a Python FastAPI backend, targeting a nopCommerce 4.70-style e-commerce schema. The prototype follows the architecture from Chapter 3: the model extracts intent, the semantic layer supplies governed business definitions, and deterministic compiler templates produce SQL.</w:t>
+        <w:t>AEGIS is implemented as a web application with a vanilla HTML and JavaScript frontend and a Python FastAPI backend, targeting a nopCommerce 4.70-style e-commerce schema. The prototype follows the architecture from Chapter 3: the model extracts intent, the semantic layer supplies approved business definitions, and deterministic compiler templates produce SQL.</w:t>
       </w:r>
     </w:p>
     <w:p>
@@ -12436,7 +12436,7 @@
           <w:rFonts w:ascii="Times New Roman" w:hAnsi="Times New Roman"/>
           <w:sz w:val="24"/>
         </w:rPr>
-        <w:t>Python configuration modules define governed metrics, dimensions, predicates, time anchors, join paths, grain rules, and mandatory platform filters.</w:t>
+        <w:t>Python configuration modules define approved metrics, dimensions, predicates, time anchors, join paths, grain rules, and mandatory platform filters.</w:t>
       </w:r>
     </w:p>
     <w:p>
@@ -12545,14 +12545,14 @@
           <w:b/>
           <w:sz w:val="24"/>
         </w:rPr>
-        <w:t xml:space="preserve">Coverage validator: </w:t>
+        <w:t xml:space="preserve">Intent validator: </w:t>
       </w:r>
       <w:r>
         <w:rPr>
           <w:rFonts w:ascii="Times New Roman" w:hAnsi="Times New Roman"/>
           <w:sz w:val="24"/>
         </w:rPr>
-        <w:t>Coverage analysis checks the original user question against the semantic layer so unsupported concepts can be rejected or clarified instead of silently mapped to the nearest available metric.</w:t>
+        <w:t>Structured intent validation checks the LLM's normalized intent against the semantic layer, while the original question is used only for narrow safety and scope cues such as writes, direct secrets, and explicit non-SQL analysis modes.</w:t>
       </w:r>
     </w:p>
     <w:p>
@@ -12866,7 +12866,7 @@
                 <w:b w:val="0"/>
                 <w:sz w:val="21"/>
               </w:rPr>
-              <w:t>Coverage</w:t>
+              <w:t>Intent validation</w:t>
             </w:r>
           </w:p>
         </w:tc>
@@ -12892,7 +12892,7 @@
                 <w:b w:val="0"/>
                 <w:sz w:val="21"/>
               </w:rPr>
-              <w:t>coverage.py</w:t>
+              <w:t>coverage.py, mapper.py</w:t>
             </w:r>
           </w:p>
         </w:tc>
@@ -12918,7 +12918,7 @@
                 <w:b w:val="0"/>
                 <w:sz w:val="21"/>
               </w:rPr>
-              <w:t>Original-question inspection for unsupported e-commerce concepts</w:t>
+              <w:t>Structured binding checks plus narrow raw-text safety/scope cues</w:t>
             </w:r>
           </w:p>
         </w:tc>
@@ -13269,7 +13269,7 @@
           <w:i w:val="0"/>
           <w:sz w:val="24"/>
         </w:rPr>
-        <w:t>This module map is included to make the prototype auditable: the thesis architecture is not only a conceptual pipeline, and each stage has a corresponding implementation boundary.</w:t>
+        <w:t>This module map makes the prototype auditable. The thesis architecture is more than a conceptual pipeline. Each stage has a corresponding implementation boundary.</w:t>
       </w:r>
     </w:p>
     <w:p>
@@ -13748,7 +13748,7 @@
           <w:i w:val="0"/>
           <w:sz w:val="24"/>
         </w:rPr>
-        <w:t>This evaluation is a prototype evaluation, not a large-scale independent leaderboard study. Its goal is to test whether the AEGIS architecture provides safe, governed natural-language analytics for a realistic e-commerce schema. General text-to-SQL benchmarks such as Spider and BIRD are valuable for SQL generation research, but they do not measure reusable dashboard widgets, semantic layer governance, or refusal of unsupported business questions.</w:t>
+        <w:t>This evaluation is a prototype evaluation, not a large-scale independent leaderboard study. Its goal is to test whether the AEGIS architecture provides safe, Approved natural-language analytics for a realistic e-commerce schema. General text-to-SQL benchmarks such as Spider and BIRD are valuable for SQL generation research, but they do not measure reusable dashboard widgets, semantic layer control, or refusal of unsupported business questions.</w:t>
       </w:r>
     </w:p>
     <w:p>
@@ -14277,7 +14277,7 @@
           <w:rFonts w:ascii="Times New Roman" w:hAnsi="Times New Roman"/>
           <w:sz w:val="24"/>
         </w:rPr>
-        <w:t>The model is prompted to generate SQL directly from a database schema. This baseline has broad expressive freedom but weak governance because joins, filters, and business definitions are inferred per request.</w:t>
+        <w:t>The model is prompted to generate SQL directly from a database schema. This baseline has broad expressive freedom but weak control because joins, filters, and business definitions are inferred per request.</w:t>
       </w:r>
     </w:p>
     <w:p>
@@ -14533,7 +14533,7 @@
           <w:i w:val="0"/>
           <w:sz w:val="24"/>
         </w:rPr>
-        <w:t>This chapter reports the current AEGIS prototype evaluation using static nopCommerce datasets committed with the repository. The evaluation separates four questions that are often mixed together: whether the system can parse a natural-language request, whether the request is covered by the semantic layer, whether the compiled SQL executes, and whether the returned result matches the expected business answer.</w:t>
+        <w:t>This chapter reports the current AEGIS prototype evaluation using static nopCommerce datasets committed with the repository. The evaluation separates four questions that are often mixed together. Can the system parse the request? Is the request inside the semantic layer? Does the compiled SQL run? Does the result match the expected business answer?</w:t>
       </w:r>
     </w:p>
     <w:p>
@@ -14548,7 +14548,7 @@
           <w:i w:val="0"/>
           <w:sz w:val="24"/>
         </w:rPr>
-        <w:t>The results should not be read as a claim that AEGIS is a perfect analytics system. A perfect score on every table would be suspicious for a prototype. Instead, the evaluation shows where the architecture is strong, where the current nopCommerce implementation is already useful, and where a visible implementation gap remains.</w:t>
+        <w:t>The results are not a claim that AEGIS is perfect. A perfect score on every table would be suspicious for a prototype. The evaluation shows where the architecture is strong, where the nopCommerce implementation works well, and where a real implementation gap remains.</w:t>
       </w:r>
     </w:p>
     <w:p>
@@ -14984,7 +14984,7 @@
                 <w:b w:val="0"/>
                 <w:sz w:val="21"/>
               </w:rPr>
-              <w:t>Checks representative metric, dimension, trend, ranking, exception, and boundary cases.</w:t>
+              <w:t>Checks selected metric, dimension, trend, ranking, exception, and boundary cases.</w:t>
             </w:r>
           </w:p>
         </w:tc>
@@ -15033,7 +15033,7 @@
           <w:i w:val="0"/>
           <w:sz w:val="24"/>
         </w:rPr>
-        <w:t>These datasets are static research artifacts, not generated at evaluation time. This matters because a thesis result must be reproducible: another reader should be able to inspect the exact questions, oracle definitions, scripts, and result files used for the reported claims.</w:t>
+        <w:t>These datasets are static research artifacts, not generated at evaluation time. This matters because a thesis result must be reproducible. Another reader should be able to inspect the exact questions, oracle definitions, scripts, and result files used for the reported claims.</w:t>
       </w:r>
     </w:p>
     <w:p>
@@ -15062,7 +15062,7 @@
           <w:i w:val="0"/>
           <w:sz w:val="24"/>
         </w:rPr>
-        <w:t>The main breadth benchmark contains natural-language questions that a store owner or administrator might ask about orders, revenue, customers, products, refunds, inventory, stores, countries, payment status, shipping, and search terms. The dataset intentionally includes unsupported questions as well, because a governed analytics system must know when not to answer.</w:t>
+        <w:t>The main breadth benchmark contains natural-language questions that a store owner or administrator might ask about orders, revenue, customers, products, refunds, inventory, stores, countries, payment status, shipping, and search terms. The dataset intentionally includes unsupported questions as well, because an approved analytics system must know when not to answer.</w:t>
       </w:r>
     </w:p>
     <w:p>
@@ -15615,7 +15615,7 @@
           <w:i w:val="0"/>
           <w:sz w:val="24"/>
         </w:rPr>
-        <w:t>This result supports the bounded-system claim. AEGIS is not trying to answer infinite arbitrary SQL questions. It is trying to answer a large, useful set of questions made available by the semantic layer and to avoid silently inventing answers for unavailable concepts.</w:t>
+        <w:t>This result supports the bounded-system claim. AEGIS does not try to answer unlimited arbitrary SQL questions. It answers a large useful set of questions made available by the semantic layer, and it avoids inventing answers for unavailable concepts.</w:t>
       </w:r>
     </w:p>
     <w:p>
@@ -15644,7 +15644,7 @@
           <w:i w:val="0"/>
           <w:sz w:val="24"/>
         </w:rPr>
-        <w:t>The Admin fidelity benchmark is stricter than asking whether AEGIS can produce some chartable SQL. It extracts reporting expectations from nopCommerce Admin analytics and compares the returned shape and values against those source-derived oracles. Exact SQL text is not required; the important question is whether the answer has the correct business meaning.</w:t>
+        <w:t>The Admin fidelity benchmark is stricter than checking whether AEGIS can produce chartable SQL. It extracts reporting expectations from nopCommerce Admin analytics and compares the returned shape and values against source-derived oracles. Exact SQL text is not required. The important question is whether the answer has the correct business meaning.</w:t>
       </w:r>
     </w:p>
     <w:p>
@@ -16033,7 +16033,7 @@
           <w:i w:val="0"/>
           <w:sz w:val="24"/>
         </w:rPr>
-        <w:t>The remaining mismatch is useful evidence rather than an embarrassment. It shows that the benchmark is capable of finding a real gap. The gap should be fixed by adding a general multi-period matrix-summary primitive to the compiler, not by hardcoding a nopCommerce report shortcut.</w:t>
+        <w:t>The remaining mismatch is useful evidence. It shows that the benchmark can find a real gap. The fix belongs in a general multi-period matrix-summary component in the compiler, not in a hardcoded nopCommerce report shortcut.</w:t>
       </w:r>
     </w:p>
     <w:p>
@@ -16518,7 +16518,7 @@
           <w:i w:val="0"/>
           <w:sz w:val="24"/>
         </w:rPr>
-        <w:t>This small suite is not presented as proof of perfection. It is a regression and coverage check over representative semantic-layer combinations. The broader 500-question benchmark and the Admin oracle mismatch are what keep the evaluation honest.</w:t>
+        <w:t>This small suite is not proof of perfection. It is a regression and coverage check over representative semantic-layer combinations. The broader 500-question benchmark and the Admin oracle mismatch are what keep the evaluation honest.</w:t>
       </w:r>
     </w:p>
     <w:p>
@@ -16547,7 +16547,7 @@
           <w:i w:val="0"/>
           <w:sz w:val="24"/>
         </w:rPr>
-        <w:t>The central architectural safety property is that the language model does not write SQL. It returns a typed intent object. SQL is then produced by deterministic templates over approved semantic-layer definitions and checked before execution. Therefore, prompt text from the user is not interpolated into executable SQL.</w:t>
+        <w:t>The central architectural safety property is that the language model does not write SQL. It returns a typed intent object. Deterministic templates then produce SQL from approved semantic-layer definitions and check the query before execution. User prompt text is not inserted into executable SQL.</w:t>
       </w:r>
     </w:p>
     <w:p>
@@ -16805,7 +16805,7 @@
                 <w:b w:val="0"/>
                 <w:sz w:val="21"/>
               </w:rPr>
-              <w:t>Coverage analysis checks the original user question against the semantic layer.</w:t>
+              <w:t>The structured intent must bind to approved semantic-layer definitions.</w:t>
             </w:r>
           </w:p>
         </w:tc>
@@ -16831,7 +16831,7 @@
                 <w:b w:val="0"/>
                 <w:sz w:val="21"/>
               </w:rPr>
-              <w:t>Coverage is finite and depends on deployment configuration.</w:t>
+              <w:t>Intent extraction can still misread vague language; debug traces and clarification reduce this risk.</w:t>
             </w:r>
           </w:p>
         </w:tc>
@@ -16950,7 +16950,7 @@
           <w:i w:val="0"/>
           <w:sz w:val="24"/>
         </w:rPr>
-        <w:t>A direct LLM-to-SQL baseline can appear attractive because it can always try to write a SELECT statement. However, allowing the model to author SQL moves business definitions, join choices, security behavior, and dialect correctness into a probabilistic component. AEGIS deliberately gives up unlimited query flexibility in exchange for governed definitions, deterministic compilation, and an explicit refusal path.</w:t>
+        <w:t>A direct LLM-to-SQL baseline can appear attractive because it can always try to write a SELECT statement. However, allowing the model to author SQL moves business definitions, join choices, security behavior, and dialect correctness into a probabilistic component. AEGIS deliberately gives up unlimited query flexibility in exchange for approved definitions, deterministic compilation, and an explicit refusal path.</w:t>
       </w:r>
     </w:p>
     <w:p>
@@ -17517,7 +17517,7 @@
           <w:i w:val="0"/>
           <w:sz w:val="24"/>
         </w:rPr>
-        <w:t>The evaluation supports three conclusions. First, a semantic-layer architecture can cover a broad set of natural e-commerce analytics questions without exposing users to raw SQL. Second, refusal is part of correctness: a system that answers an unsupported question with a plausible but wrong query is less trustworthy than one that declines. Third, the remaining Admin fidelity gap is an implementation gap in the current compiler, not evidence that the architecture must be replaced.</w:t>
+        <w:t>The evaluation supports three conclusions. First, a semantic-layer architecture can cover a broad set of natural e-commerce analytics questions without exposing users to raw SQL. Second, refusal is part of correctness. A system that answers an unsupported question with a plausible but wrong query is less trustworthy than one that declines. Third, the remaining Admin fidelity gap is an implementation gap in the current compiler, not evidence that the architecture must be replaced.</w:t>
       </w:r>
     </w:p>
     <w:p>
@@ -18282,7 +18282,7 @@
           <w:rFonts w:ascii="Times New Roman" w:hAnsi="Times New Roman"/>
           <w:sz w:val="23"/>
         </w:rPr>
-        <w:t>[15]  J. Valkenburgh, "Enhancing business dashboards with explanatory analytics and AI: Exploring the use of AI and explanatory analytics to enhance business decision-making," M.S. thesis, Information Management, Turku School of Economics, University of Turku, Finland, 2024.</w:t>
+        <w:t>[15]  J. Valkenburgh, "Enhancing business dashboards with explanatory analytics and AI: Exploring the use of AI and explanatory analytics to improve business decision-making," M.S. thesis, Information Management, Turku School of Economics, University of Turku, Finland, 2024.</w:t>
       </w:r>
     </w:p>
     <w:p>

</xml_diff>

<commit_message>
Correct the table of contents for the rewritten Chapter 5
The contents page is a hardcoded list in fm.py, so renaming two sections
in ch5.py left it describing a chapter that no longer exists. It still
advertised "5.3 Admin Fidelity Benchmark" and "5.4 Focused Semantic
Coverage" against actual headings of "5.3 Fidelity Against nopCommerce's
Own Report Logic" and "5.4 Latency".

The second entry is the one that matters: the focused semantic coverage
suite was removed from this thesis, so the contents page was pointing an
examiner at a page number for a corpus the evaluation no longer contains.

Co-Authored-By: Claude Opus 5 <noreply@anthropic.com>
Claude-Session: https://claude.ai/code/session_01AudYTRar4rAmiaM2SEkcpV
</commit_message>
<xml_diff>
--- a/docs/AEGIS_Thesis_Final_Md_Riaz.docx
+++ b/docs/AEGIS_Thesis_Final_Md_Riaz.docx
@@ -1681,7 +1681,7 @@
           <w:b w:val="0"/>
           <w:sz w:val="23"/>
         </w:rPr>
-        <w:t>5.3 Admin Fidelity Benchmark</w:t>
+        <w:t>5.3 Fidelity Against nopCommerce's Own Report Logic</w:t>
         <w:tab/>
         <w:t>25</w:t>
       </w:r>
@@ -1701,7 +1701,7 @@
           <w:b w:val="0"/>
           <w:sz w:val="23"/>
         </w:rPr>
-        <w:t>5.4 Focused Semantic Coverage</w:t>
+        <w:t>5.4 Latency</w:t>
         <w:tab/>
         <w:t>25</w:t>
       </w:r>

</xml_diff>